<commit_message>
docs for old-style provid
</commit_message>
<xml_diff>
--- a/doc/ADES_Description_22Dec2025.docx
+++ b/doc/ADES_Description_22Dec2025.docx
@@ -879,13 +879,20 @@
         <w:t>5</w:t>
       </w:r>
       <w:r>
-        <w:t xml:space="preserve">, allowing </w:t>
-      </w:r>
-      <w:r>
-        <w:t>IAU-registered globally unique identifiers (in particular for Rubin Observations)</w:t>
-      </w:r>
-      <w:bookmarkStart w:id="0" w:name="_GoBack"/>
-      <w:bookmarkEnd w:id="0"/>
+        <w:t>, allowing IAU-registered globally unique identifiers (in particular for Rubin Observations)</w:t>
+      </w:r>
+    </w:p>
+    <w:p>
+      <w:pPr>
+        <w:pStyle w:val="ListParagraph"/>
+        <w:numPr>
+          <w:ilvl w:val="0"/>
+          <w:numId w:val="15"/>
+        </w:numPr>
+      </w:pPr>
+      <w:r>
+        <w:t>Allow submissions of old-style provides (e.g.  “A899 CA”)</w:t>
+      </w:r>
     </w:p>
     <w:p/>
     <w:p/>
@@ -2583,12 +2590,12 @@
       <w:pPr>
         <w:pStyle w:val="Heading1"/>
       </w:pPr>
-      <w:bookmarkStart w:id="1" w:name="_Toc161139879"/>
+      <w:bookmarkStart w:id="0" w:name="_Toc161139879"/>
       <w:r>
         <w:lastRenderedPageBreak/>
         <w:t>Introduction</w:t>
       </w:r>
-      <w:bookmarkEnd w:id="1"/>
+      <w:bookmarkEnd w:id="0"/>
     </w:p>
     <w:p/>
     <w:p>
@@ -2787,12 +2794,12 @@
       <w:pPr>
         <w:pStyle w:val="Heading1"/>
       </w:pPr>
-      <w:bookmarkStart w:id="2" w:name="_Toc161139880"/>
+      <w:bookmarkStart w:id="1" w:name="_Toc161139880"/>
       <w:r>
         <w:lastRenderedPageBreak/>
         <w:t>Overview</w:t>
       </w:r>
-      <w:bookmarkEnd w:id="2"/>
+      <w:bookmarkEnd w:id="1"/>
     </w:p>
     <w:p/>
     <w:p>
@@ -2956,12 +2963,12 @@
       <w:pPr>
         <w:pStyle w:val="Heading1"/>
       </w:pPr>
-      <w:bookmarkStart w:id="3" w:name="_Toc161139881"/>
+      <w:bookmarkStart w:id="2" w:name="_Toc161139881"/>
       <w:r>
         <w:lastRenderedPageBreak/>
         <w:t>Revising ADES</w:t>
       </w:r>
-      <w:bookmarkEnd w:id="3"/>
+      <w:bookmarkEnd w:id="2"/>
     </w:p>
     <w:p/>
     <w:p>
@@ -3046,12 +3053,12 @@
       <w:pPr>
         <w:pStyle w:val="Heading1"/>
       </w:pPr>
-      <w:bookmarkStart w:id="4" w:name="_Toc161139882"/>
+      <w:bookmarkStart w:id="3" w:name="_Toc161139882"/>
       <w:r>
         <w:lastRenderedPageBreak/>
         <w:t>ADES in XML</w:t>
       </w:r>
-      <w:bookmarkEnd w:id="4"/>
+      <w:bookmarkEnd w:id="3"/>
     </w:p>
     <w:p/>
     <w:p>
@@ -3091,21 +3098,11 @@
       <w:r>
         <w:t xml:space="preserve"> </w:t>
       </w:r>
-      <w:r>
-        <w:fldChar w:fldCharType="begin"/>
-      </w:r>
-      <w:r>
-        <w:instrText xml:space="preserve"> REF _Ref476576078 \r </w:instrText>
-      </w:r>
-      <w:r>
-        <w:fldChar w:fldCharType="separate"/>
-      </w:r>
-      <w:r>
-        <w:t>5</w:t>
-      </w:r>
-      <w:r>
-        <w:fldChar w:fldCharType="end"/>
-      </w:r>
+      <w:fldSimple w:instr=" REF _Ref476576078 \r ">
+        <w:r>
+          <w:t>5</w:t>
+        </w:r>
+      </w:fldSimple>
       <w:r>
         <w:t>, below</w:t>
       </w:r>
@@ -3225,14 +3222,14 @@
       <w:pPr>
         <w:pStyle w:val="Heading2"/>
       </w:pPr>
-      <w:bookmarkStart w:id="5" w:name="_Toc161139883"/>
+      <w:bookmarkStart w:id="4" w:name="_Toc161139883"/>
       <w:r>
         <w:t>High-level ADES S</w:t>
       </w:r>
       <w:r>
         <w:t>tructure</w:t>
       </w:r>
-      <w:bookmarkEnd w:id="5"/>
+      <w:bookmarkEnd w:id="4"/>
     </w:p>
     <w:p/>
     <w:p>
@@ -3554,30 +3551,17 @@
       <w:r>
         <w:t xml:space="preserve"> in any number and in any order. </w:t>
       </w:r>
-      <w:r>
-        <w:fldChar w:fldCharType="begin"/>
-      </w:r>
-      <w:r>
-        <w:instrText xml:space="preserve"> REF _Ref473211114 </w:instrText>
-      </w:r>
-      <w:r>
-        <w:fldChar w:fldCharType="separate"/>
-      </w:r>
-      <w:r>
-        <w:t xml:space="preserve">Table </w:t>
-      </w:r>
-      <w:r>
-        <w:rPr>
-          <w:noProof/>
-        </w:rPr>
-        <w:t>1</w:t>
-      </w:r>
-      <w:r>
-        <w:rPr>
-          <w:noProof/>
-        </w:rPr>
-        <w:fldChar w:fldCharType="end"/>
-      </w:r>
+      <w:fldSimple w:instr=" REF _Ref473211114 ">
+        <w:r>
+          <w:t xml:space="preserve">Table </w:t>
+        </w:r>
+        <w:r>
+          <w:rPr>
+            <w:noProof/>
+          </w:rPr>
+          <w:t>1</w:t>
+        </w:r>
+      </w:fldSimple>
       <w:r>
         <w:t xml:space="preserve"> lists the elements that can appear in an </w:t>
       </w:r>
@@ -3611,33 +3595,20 @@
       <w:pPr>
         <w:pStyle w:val="Caption"/>
       </w:pPr>
-      <w:bookmarkStart w:id="6" w:name="_Ref473211114"/>
+      <w:bookmarkStart w:id="5" w:name="_Ref473211114"/>
       <w:r>
         <w:lastRenderedPageBreak/>
         <w:t xml:space="preserve">Table </w:t>
       </w:r>
-      <w:r>
-        <w:fldChar w:fldCharType="begin"/>
-      </w:r>
-      <w:r>
-        <w:instrText xml:space="preserve"> SEQ Table \* ARABIC </w:instrText>
-      </w:r>
-      <w:r>
-        <w:fldChar w:fldCharType="separate"/>
-      </w:r>
-      <w:r>
-        <w:rPr>
-          <w:noProof/>
-        </w:rPr>
-        <w:t>1</w:t>
-      </w:r>
-      <w:r>
-        <w:rPr>
-          <w:noProof/>
-        </w:rPr>
-        <w:fldChar w:fldCharType="end"/>
-      </w:r>
-      <w:bookmarkEnd w:id="6"/>
+      <w:fldSimple w:instr=" SEQ Table \* ARABIC ">
+        <w:r>
+          <w:rPr>
+            <w:noProof/>
+          </w:rPr>
+          <w:t>1</w:t>
+        </w:r>
+      </w:fldSimple>
+      <w:bookmarkEnd w:id="5"/>
       <w:r>
         <w:t xml:space="preserve">. Description of the </w:t>
       </w:r>
@@ -4868,30 +4839,17 @@
       <w:r>
         <w:t xml:space="preserve">As indicated in </w:t>
       </w:r>
-      <w:r>
-        <w:fldChar w:fldCharType="begin"/>
-      </w:r>
-      <w:r>
-        <w:instrText xml:space="preserve"> REF _Ref473023927 </w:instrText>
-      </w:r>
-      <w:r>
-        <w:fldChar w:fldCharType="separate"/>
-      </w:r>
-      <w:r>
-        <w:t xml:space="preserve">Table </w:t>
-      </w:r>
-      <w:r>
-        <w:rPr>
-          <w:noProof/>
-        </w:rPr>
-        <w:t>2</w:t>
-      </w:r>
-      <w:r>
-        <w:rPr>
-          <w:noProof/>
-        </w:rPr>
-        <w:fldChar w:fldCharType="end"/>
-      </w:r>
+      <w:fldSimple w:instr=" REF _Ref473023927 ">
+        <w:r>
+          <w:t xml:space="preserve">Table </w:t>
+        </w:r>
+        <w:r>
+          <w:rPr>
+            <w:noProof/>
+          </w:rPr>
+          <w:t>2</w:t>
+        </w:r>
+      </w:fldSimple>
       <w:r>
         <w:t xml:space="preserve">, an </w:t>
       </w:r>
@@ -4939,30 +4897,17 @@
       <w:r>
         <w:t xml:space="preserve"> (</w:t>
       </w:r>
-      <w:r>
-        <w:fldChar w:fldCharType="begin"/>
-      </w:r>
-      <w:r>
-        <w:instrText xml:space="preserve"> REF _Ref473018694 </w:instrText>
-      </w:r>
-      <w:r>
-        <w:fldChar w:fldCharType="separate"/>
-      </w:r>
-      <w:r>
-        <w:t xml:space="preserve">Table </w:t>
-      </w:r>
-      <w:r>
-        <w:rPr>
-          <w:noProof/>
-        </w:rPr>
-        <w:t>12</w:t>
-      </w:r>
-      <w:r>
-        <w:rPr>
-          <w:noProof/>
-        </w:rPr>
-        <w:fldChar w:fldCharType="end"/>
-      </w:r>
+      <w:fldSimple w:instr=" REF _Ref473018694 ">
+        <w:r>
+          <w:t xml:space="preserve">Table </w:t>
+        </w:r>
+        <w:r>
+          <w:rPr>
+            <w:noProof/>
+          </w:rPr>
+          <w:t>12</w:t>
+        </w:r>
+      </w:fldSimple>
       <w:r>
         <w:t xml:space="preserve">) conveys what was </w:t>
       </w:r>
@@ -5031,32 +4976,19 @@
       <w:pPr>
         <w:pStyle w:val="Caption"/>
       </w:pPr>
-      <w:bookmarkStart w:id="7" w:name="_Ref473023927"/>
+      <w:bookmarkStart w:id="6" w:name="_Ref473023927"/>
       <w:r>
         <w:t xml:space="preserve">Table </w:t>
       </w:r>
-      <w:r>
-        <w:fldChar w:fldCharType="begin"/>
-      </w:r>
-      <w:r>
-        <w:instrText xml:space="preserve"> SEQ Table \* ARABIC </w:instrText>
-      </w:r>
-      <w:r>
-        <w:fldChar w:fldCharType="separate"/>
-      </w:r>
-      <w:r>
-        <w:rPr>
-          <w:noProof/>
-        </w:rPr>
-        <w:t>2</w:t>
-      </w:r>
-      <w:r>
-        <w:rPr>
-          <w:noProof/>
-        </w:rPr>
-        <w:fldChar w:fldCharType="end"/>
-      </w:r>
-      <w:bookmarkEnd w:id="7"/>
+      <w:fldSimple w:instr=" SEQ Table \* ARABIC ">
+        <w:r>
+          <w:rPr>
+            <w:noProof/>
+          </w:rPr>
+          <w:t>2</w:t>
+        </w:r>
+      </w:fldSimple>
+      <w:bookmarkEnd w:id="6"/>
       <w:r>
         <w:t xml:space="preserve">. Description of the </w:t>
       </w:r>
@@ -5681,21 +5613,11 @@
       <w:r>
         <w:t xml:space="preserve">. In the next section (Sec. </w:t>
       </w:r>
-      <w:r>
-        <w:fldChar w:fldCharType="begin"/>
-      </w:r>
-      <w:r>
-        <w:instrText xml:space="preserve"> REF _Ref473301578 \w </w:instrText>
-      </w:r>
-      <w:r>
-        <w:fldChar w:fldCharType="separate"/>
-      </w:r>
-      <w:r>
-        <w:t>4.2</w:t>
-      </w:r>
-      <w:r>
-        <w:fldChar w:fldCharType="end"/>
-      </w:r>
+      <w:fldSimple w:instr=" REF _Ref473301578 \w ">
+        <w:r>
+          <w:t>4.2</w:t>
+        </w:r>
+      </w:fldSimple>
       <w:r>
         <w:t>) we cover the observation elements (</w:t>
       </w:r>
@@ -5735,21 +5657,11 @@
       <w:r>
         <w:t xml:space="preserve">) and in Sec. </w:t>
       </w:r>
-      <w:r>
-        <w:fldChar w:fldCharType="begin"/>
-      </w:r>
-      <w:r>
-        <w:instrText xml:space="preserve"> REF _Ref474762057 \r </w:instrText>
-      </w:r>
-      <w:r>
-        <w:fldChar w:fldCharType="separate"/>
-      </w:r>
-      <w:r>
-        <w:t>4.3</w:t>
-      </w:r>
-      <w:r>
-        <w:fldChar w:fldCharType="end"/>
-      </w:r>
+      <w:fldSimple w:instr=" REF _Ref474762057 \r ">
+        <w:r>
+          <w:t>4.3</w:t>
+        </w:r>
+      </w:fldSimple>
       <w:r>
         <w:t xml:space="preserve"> </w:t>
       </w:r>
@@ -5770,21 +5682,11 @@
       <w:r>
         <w:t xml:space="preserve"> in Sec. </w:t>
       </w:r>
-      <w:r>
-        <w:fldChar w:fldCharType="begin"/>
-      </w:r>
-      <w:r>
-        <w:instrText xml:space="preserve"> REF _Ref474762100 \r </w:instrText>
-      </w:r>
-      <w:r>
-        <w:fldChar w:fldCharType="separate"/>
-      </w:r>
-      <w:r>
-        <w:t>4.4</w:t>
-      </w:r>
-      <w:r>
-        <w:fldChar w:fldCharType="end"/>
-      </w:r>
+      <w:fldSimple w:instr=" REF _Ref474762100 \r ">
+        <w:r>
+          <w:t>4.4</w:t>
+        </w:r>
+      </w:fldSimple>
       <w:r>
         <w:t xml:space="preserve"> the </w:t>
       </w:r>
@@ -5816,21 +5718,11 @@
       <w:r>
         <w:t xml:space="preserve"> Finally, in Sec. </w:t>
       </w:r>
-      <w:r>
-        <w:fldChar w:fldCharType="begin"/>
-      </w:r>
-      <w:r>
-        <w:instrText xml:space="preserve"> REF _Ref474762124 \r </w:instrText>
-      </w:r>
-      <w:r>
-        <w:fldChar w:fldCharType="separate"/>
-      </w:r>
-      <w:r>
-        <w:t>4.5</w:t>
-      </w:r>
-      <w:r>
-        <w:fldChar w:fldCharType="end"/>
-      </w:r>
+      <w:fldSimple w:instr=" REF _Ref474762124 \r ">
+        <w:r>
+          <w:t>4.5</w:t>
+        </w:r>
+      </w:fldSimple>
       <w:r>
         <w:t xml:space="preserve"> </w:t>
       </w:r>
@@ -5850,8 +5742,8 @@
       <w:pPr>
         <w:pStyle w:val="Heading2"/>
       </w:pPr>
-      <w:bookmarkStart w:id="8" w:name="_Ref473301578"/>
-      <w:bookmarkStart w:id="9" w:name="_Toc161139884"/>
+      <w:bookmarkStart w:id="7" w:name="_Ref473301578"/>
+      <w:bookmarkStart w:id="8" w:name="_Toc161139884"/>
       <w:r>
         <w:lastRenderedPageBreak/>
         <w:t>Structure of ADES O</w:t>
@@ -5862,8 +5754,8 @@
       <w:r>
         <w:t xml:space="preserve"> Elements</w:t>
       </w:r>
+      <w:bookmarkEnd w:id="7"/>
       <w:bookmarkEnd w:id="8"/>
-      <w:bookmarkEnd w:id="9"/>
     </w:p>
     <w:p/>
     <w:p>
@@ -5897,30 +5789,17 @@
       <w:r>
         <w:t xml:space="preserve">of the four observation elements. </w:t>
       </w:r>
-      <w:r>
-        <w:fldChar w:fldCharType="begin"/>
-      </w:r>
-      <w:r>
-        <w:instrText xml:space="preserve"> REF _Ref473215016 </w:instrText>
-      </w:r>
-      <w:r>
-        <w:fldChar w:fldCharType="separate"/>
-      </w:r>
-      <w:r>
-        <w:t xml:space="preserve">Table </w:t>
-      </w:r>
-      <w:r>
-        <w:rPr>
-          <w:noProof/>
-        </w:rPr>
-        <w:t>3</w:t>
-      </w:r>
-      <w:r>
-        <w:rPr>
-          <w:noProof/>
-        </w:rPr>
-        <w:fldChar w:fldCharType="end"/>
-      </w:r>
+      <w:fldSimple w:instr=" REF _Ref473215016 ">
+        <w:r>
+          <w:t xml:space="preserve">Table </w:t>
+        </w:r>
+        <w:r>
+          <w:rPr>
+            <w:noProof/>
+          </w:rPr>
+          <w:t>3</w:t>
+        </w:r>
+      </w:fldSimple>
       <w:r>
         <w:t xml:space="preserve"> </w:t>
       </w:r>
@@ -5938,30 +5817,17 @@
       <w:r>
         <w:t xml:space="preserve"> Here as elsewhere, the ordering of the elements must be as specified in the table. There are some sets of elements that, for convenience of description and presentation, are collected into groups in </w:t>
       </w:r>
-      <w:r>
-        <w:fldChar w:fldCharType="begin"/>
-      </w:r>
-      <w:r>
-        <w:instrText xml:space="preserve"> REF _Ref473215016 </w:instrText>
-      </w:r>
-      <w:r>
-        <w:fldChar w:fldCharType="separate"/>
-      </w:r>
-      <w:r>
-        <w:t xml:space="preserve">Table </w:t>
-      </w:r>
-      <w:r>
-        <w:rPr>
-          <w:noProof/>
-        </w:rPr>
-        <w:t>3</w:t>
-      </w:r>
-      <w:r>
-        <w:rPr>
-          <w:noProof/>
-        </w:rPr>
-        <w:fldChar w:fldCharType="end"/>
-      </w:r>
+      <w:fldSimple w:instr=" REF _Ref473215016 ">
+        <w:r>
+          <w:t xml:space="preserve">Table </w:t>
+        </w:r>
+        <w:r>
+          <w:rPr>
+            <w:noProof/>
+          </w:rPr>
+          <w:t>3</w:t>
+        </w:r>
+      </w:fldSimple>
       <w:r>
         <w:t xml:space="preserve"> and described </w:t>
       </w:r>
@@ -5977,30 +5843,17 @@
       <w:r>
         <w:t xml:space="preserve">in </w:t>
       </w:r>
-      <w:r>
-        <w:fldChar w:fldCharType="begin"/>
-      </w:r>
-      <w:r>
-        <w:instrText xml:space="preserve"> REF _Ref473215016 </w:instrText>
-      </w:r>
-      <w:r>
-        <w:fldChar w:fldCharType="separate"/>
-      </w:r>
-      <w:r>
-        <w:t xml:space="preserve">Table </w:t>
-      </w:r>
-      <w:r>
-        <w:rPr>
-          <w:noProof/>
-        </w:rPr>
-        <w:t>3</w:t>
-      </w:r>
-      <w:r>
-        <w:rPr>
-          <w:noProof/>
-        </w:rPr>
-        <w:fldChar w:fldCharType="end"/>
-      </w:r>
+      <w:fldSimple w:instr=" REF _Ref473215016 ">
+        <w:r>
+          <w:t xml:space="preserve">Table </w:t>
+        </w:r>
+        <w:r>
+          <w:rPr>
+            <w:noProof/>
+          </w:rPr>
+          <w:t>3</w:t>
+        </w:r>
+      </w:fldSimple>
       <w:r>
         <w:t>.</w:t>
       </w:r>
@@ -6010,32 +5863,19 @@
       <w:pPr>
         <w:pStyle w:val="Caption"/>
       </w:pPr>
-      <w:bookmarkStart w:id="10" w:name="_Ref473215016"/>
+      <w:bookmarkStart w:id="9" w:name="_Ref473215016"/>
       <w:r>
         <w:t xml:space="preserve">Table </w:t>
       </w:r>
-      <w:r>
-        <w:fldChar w:fldCharType="begin"/>
-      </w:r>
-      <w:r>
-        <w:instrText xml:space="preserve"> SEQ Table \* ARABIC </w:instrText>
-      </w:r>
-      <w:r>
-        <w:fldChar w:fldCharType="separate"/>
-      </w:r>
-      <w:r>
-        <w:rPr>
-          <w:noProof/>
-        </w:rPr>
-        <w:t>3</w:t>
-      </w:r>
-      <w:r>
-        <w:rPr>
-          <w:noProof/>
-        </w:rPr>
-        <w:fldChar w:fldCharType="end"/>
-      </w:r>
-      <w:bookmarkEnd w:id="10"/>
+      <w:fldSimple w:instr=" SEQ Table \* ARABIC ">
+        <w:r>
+          <w:rPr>
+            <w:noProof/>
+          </w:rPr>
+          <w:t>3</w:t>
+        </w:r>
+      </w:fldSimple>
+      <w:bookmarkEnd w:id="9"/>
       <w:r>
         <w:t>. Observation element and their required order. The designation "</w:t>
       </w:r>
@@ -11757,16 +11597,16 @@
       <w:pPr>
         <w:pStyle w:val="Heading3"/>
       </w:pPr>
-      <w:bookmarkStart w:id="11" w:name="_Ref474247915"/>
-      <w:bookmarkStart w:id="12" w:name="_Toc161139885"/>
-      <w:bookmarkStart w:id="13" w:name="_Ref473215434"/>
-      <w:bookmarkStart w:id="14" w:name="_Ref473215466"/>
+      <w:bookmarkStart w:id="10" w:name="_Ref474247915"/>
+      <w:bookmarkStart w:id="11" w:name="_Toc161139885"/>
+      <w:bookmarkStart w:id="12" w:name="_Ref473215434"/>
+      <w:bookmarkStart w:id="13" w:name="_Ref473215466"/>
       <w:r>
         <w:lastRenderedPageBreak/>
         <w:t>Identification Group</w:t>
       </w:r>
+      <w:bookmarkEnd w:id="10"/>
       <w:bookmarkEnd w:id="11"/>
-      <w:bookmarkEnd w:id="12"/>
     </w:p>
     <w:p/>
     <w:p>
@@ -11788,30 +11628,17 @@
       <w:r>
         <w:t xml:space="preserve"> (</w:t>
       </w:r>
-      <w:r>
-        <w:fldChar w:fldCharType="begin"/>
-      </w:r>
-      <w:r>
-        <w:instrText xml:space="preserve"> REF _Ref473729153 </w:instrText>
-      </w:r>
-      <w:r>
-        <w:fldChar w:fldCharType="separate"/>
-      </w:r>
-      <w:r>
-        <w:t xml:space="preserve">Table </w:t>
-      </w:r>
-      <w:r>
-        <w:rPr>
-          <w:noProof/>
-        </w:rPr>
-        <w:t>4</w:t>
-      </w:r>
-      <w:r>
-        <w:rPr>
-          <w:noProof/>
-        </w:rPr>
-        <w:fldChar w:fldCharType="end"/>
-      </w:r>
+      <w:fldSimple w:instr=" REF _Ref473729153 ">
+        <w:r>
+          <w:t xml:space="preserve">Table </w:t>
+        </w:r>
+        <w:r>
+          <w:rPr>
+            <w:noProof/>
+          </w:rPr>
+          <w:t>4</w:t>
+        </w:r>
+      </w:fldSimple>
       <w:r>
         <w:t xml:space="preserve">) includes </w:t>
       </w:r>
@@ -11830,30 +11657,17 @@
       <w:r>
         <w:t xml:space="preserve">As shown in </w:t>
       </w:r>
-      <w:r>
-        <w:fldChar w:fldCharType="begin"/>
-      </w:r>
-      <w:r>
-        <w:instrText xml:space="preserve"> REF _Ref473729153 </w:instrText>
-      </w:r>
-      <w:r>
-        <w:fldChar w:fldCharType="separate"/>
-      </w:r>
-      <w:r>
-        <w:t xml:space="preserve">Table </w:t>
-      </w:r>
-      <w:r>
-        <w:rPr>
-          <w:noProof/>
-        </w:rPr>
-        <w:t>4</w:t>
-      </w:r>
-      <w:r>
-        <w:rPr>
-          <w:noProof/>
-        </w:rPr>
-        <w:fldChar w:fldCharType="end"/>
-      </w:r>
+      <w:fldSimple w:instr=" REF _Ref473729153 ">
+        <w:r>
+          <w:t xml:space="preserve">Table </w:t>
+        </w:r>
+        <w:r>
+          <w:rPr>
+            <w:noProof/>
+          </w:rPr>
+          <w:t>4</w:t>
+        </w:r>
+      </w:fldSimple>
       <w:r>
         <w:t>, there are four alternate presentations (labeled A-D</w:t>
       </w:r>
@@ -12004,33 +11818,20 @@
       <w:pPr>
         <w:pStyle w:val="Caption"/>
       </w:pPr>
-      <w:bookmarkStart w:id="15" w:name="_Ref473729153"/>
+      <w:bookmarkStart w:id="14" w:name="_Ref473729153"/>
       <w:r>
         <w:t xml:space="preserve">Table </w:t>
       </w:r>
-      <w:r>
-        <w:fldChar w:fldCharType="begin"/>
-      </w:r>
-      <w:r>
-        <w:instrText xml:space="preserve"> SEQ Table \* ARABIC </w:instrText>
-      </w:r>
-      <w:r>
-        <w:fldChar w:fldCharType="separate"/>
-      </w:r>
-      <w:r>
-        <w:rPr>
-          <w:noProof/>
-        </w:rPr>
-        <w:t>4</w:t>
-      </w:r>
-      <w:r>
-        <w:rPr>
-          <w:noProof/>
-        </w:rPr>
-        <w:fldChar w:fldCharType="end"/>
-      </w:r>
-      <w:bookmarkEnd w:id="13"/>
-      <w:bookmarkEnd w:id="15"/>
+      <w:fldSimple w:instr=" SEQ Table \* ARABIC ">
+        <w:r>
+          <w:rPr>
+            <w:noProof/>
+          </w:rPr>
+          <w:t>4</w:t>
+        </w:r>
+      </w:fldSimple>
+      <w:bookmarkEnd w:id="12"/>
+      <w:bookmarkEnd w:id="14"/>
       <w:r>
         <w:t xml:space="preserve"> </w:t>
       </w:r>
@@ -13123,30 +12924,17 @@
       <w:r>
         <w:t xml:space="preserve">, Alternative D in </w:t>
       </w:r>
-      <w:r>
-        <w:fldChar w:fldCharType="begin"/>
-      </w:r>
-      <w:r>
-        <w:instrText xml:space="preserve"> REF _Ref473729153 </w:instrText>
-      </w:r>
-      <w:r>
-        <w:fldChar w:fldCharType="separate"/>
-      </w:r>
-      <w:r>
-        <w:t xml:space="preserve">Table </w:t>
-      </w:r>
-      <w:r>
-        <w:rPr>
-          <w:noProof/>
-        </w:rPr>
-        <w:t>4</w:t>
-      </w:r>
-      <w:r>
-        <w:rPr>
-          <w:noProof/>
-        </w:rPr>
-        <w:fldChar w:fldCharType="end"/>
-      </w:r>
+      <w:fldSimple w:instr=" REF _Ref473729153 ">
+        <w:r>
+          <w:t xml:space="preserve">Table </w:t>
+        </w:r>
+        <w:r>
+          <w:rPr>
+            <w:noProof/>
+          </w:rPr>
+          <w:t>4</w:t>
+        </w:r>
+      </w:fldSimple>
       <w:r>
         <w:t xml:space="preserve"> applies, and</w:t>
       </w:r>
@@ -13488,30 +13276,17 @@
       <w:r>
         <w:t xml:space="preserve"> is given by examples in </w:t>
       </w:r>
-      <w:r>
-        <w:fldChar w:fldCharType="begin"/>
-      </w:r>
-      <w:r>
-        <w:instrText xml:space="preserve"> REF _Ref473799400 </w:instrText>
-      </w:r>
-      <w:r>
-        <w:fldChar w:fldCharType="separate"/>
-      </w:r>
-      <w:r>
-        <w:t xml:space="preserve">Table </w:t>
-      </w:r>
-      <w:r>
-        <w:rPr>
-          <w:noProof/>
-        </w:rPr>
-        <w:t>5</w:t>
-      </w:r>
-      <w:r>
-        <w:rPr>
-          <w:noProof/>
-        </w:rPr>
-        <w:fldChar w:fldCharType="end"/>
-      </w:r>
+      <w:fldSimple w:instr=" REF _Ref473799400 ">
+        <w:r>
+          <w:t xml:space="preserve">Table </w:t>
+        </w:r>
+        <w:r>
+          <w:rPr>
+            <w:noProof/>
+          </w:rPr>
+          <w:t>5</w:t>
+        </w:r>
+      </w:fldSimple>
       <w:r>
         <w:t>.</w:t>
       </w:r>
@@ -13526,32 +13301,19 @@
         <w:pStyle w:val="Caption"/>
         <w:keepNext/>
       </w:pPr>
-      <w:bookmarkStart w:id="16" w:name="_Ref473799400"/>
+      <w:bookmarkStart w:id="15" w:name="_Ref473799400"/>
       <w:r>
         <w:t xml:space="preserve">Table </w:t>
       </w:r>
-      <w:r>
-        <w:fldChar w:fldCharType="begin"/>
-      </w:r>
-      <w:r>
-        <w:instrText xml:space="preserve"> SEQ Table \* ARABIC </w:instrText>
-      </w:r>
-      <w:r>
-        <w:fldChar w:fldCharType="separate"/>
-      </w:r>
-      <w:r>
-        <w:rPr>
-          <w:noProof/>
-        </w:rPr>
-        <w:t>5</w:t>
-      </w:r>
-      <w:r>
-        <w:rPr>
-          <w:noProof/>
-        </w:rPr>
-        <w:fldChar w:fldCharType="end"/>
-      </w:r>
-      <w:bookmarkEnd w:id="16"/>
+      <w:fldSimple w:instr=" SEQ Table \* ARABIC ">
+        <w:r>
+          <w:rPr>
+            <w:noProof/>
+          </w:rPr>
+          <w:t>5</w:t>
+        </w:r>
+      </w:fldSimple>
+      <w:bookmarkEnd w:id="15"/>
       <w:r>
         <w:t>. Example</w:t>
       </w:r>
@@ -14044,6 +13806,106 @@
                 <w:sz w:val="22"/>
                 <w:szCs w:val="22"/>
               </w:rPr>
+              <w:t>(442)</w:t>
+            </w:r>
+          </w:p>
+        </w:tc>
+        <w:tc>
+          <w:tcPr>
+            <w:tcW w:w="1620" w:type="dxa"/>
+          </w:tcPr>
+          <w:p>
+            <w:pPr>
+              <w:pStyle w:val="FootnoteText"/>
+              <w:jc w:val="left"/>
+              <w:rPr>
+                <w:rFonts w:ascii="Courier" w:hAnsi="Courier"/>
+                <w:sz w:val="22"/>
+                <w:szCs w:val="22"/>
+              </w:rPr>
+            </w:pPr>
+            <w:r>
+              <w:rPr>
+                <w:rFonts w:ascii="Courier" w:hAnsi="Courier"/>
+                <w:sz w:val="22"/>
+                <w:szCs w:val="22"/>
+              </w:rPr>
+              <w:t>442</w:t>
+            </w:r>
+          </w:p>
+        </w:tc>
+        <w:tc>
+          <w:tcPr>
+            <w:tcW w:w="2808" w:type="dxa"/>
+          </w:tcPr>
+          <w:p>
+            <w:pPr>
+              <w:pStyle w:val="FootnoteText"/>
+              <w:jc w:val="left"/>
+              <w:rPr>
+                <w:rFonts w:ascii="Courier" w:hAnsi="Courier"/>
+                <w:sz w:val="22"/>
+                <w:szCs w:val="22"/>
+              </w:rPr>
+            </w:pPr>
+            <w:r>
+              <w:rPr>
+                <w:rFonts w:ascii="Courier" w:hAnsi="Courier"/>
+                <w:sz w:val="22"/>
+                <w:szCs w:val="22"/>
+              </w:rPr>
+              <w:t>A899 CA</w:t>
+            </w:r>
+            <w:bookmarkStart w:id="16" w:name="_GoBack"/>
+            <w:bookmarkEnd w:id="16"/>
+          </w:p>
+        </w:tc>
+      </w:tr>
+      <w:tr>
+        <w:trPr>
+          <w:trHeight w:val="266"/>
+          <w:jc w:val="center"/>
+        </w:trPr>
+        <w:tc>
+          <w:tcPr>
+            <w:tcW w:w="1868" w:type="dxa"/>
+          </w:tcPr>
+          <w:p>
+            <w:pPr>
+              <w:pStyle w:val="FootnoteText"/>
+              <w:jc w:val="left"/>
+              <w:rPr>
+                <w:sz w:val="22"/>
+                <w:szCs w:val="22"/>
+              </w:rPr>
+            </w:pPr>
+            <w:r>
+              <w:rPr>
+                <w:sz w:val="22"/>
+                <w:szCs w:val="22"/>
+              </w:rPr>
+              <w:t>Minor Planet</w:t>
+            </w:r>
+          </w:p>
+        </w:tc>
+        <w:tc>
+          <w:tcPr>
+            <w:tcW w:w="2560" w:type="dxa"/>
+          </w:tcPr>
+          <w:p>
+            <w:pPr>
+              <w:pStyle w:val="FootnoteText"/>
+              <w:jc w:val="left"/>
+              <w:rPr>
+                <w:sz w:val="22"/>
+                <w:szCs w:val="22"/>
+              </w:rPr>
+            </w:pPr>
+            <w:r>
+              <w:rPr>
+                <w:sz w:val="22"/>
+                <w:szCs w:val="22"/>
+              </w:rPr>
               <w:t>2014 AA</w:t>
             </w:r>
           </w:p>
@@ -16188,35 +16050,26 @@
       <w:r>
         <w:t xml:space="preserve"> (</w:t>
       </w:r>
-      <w:r>
-        <w:fldChar w:fldCharType="begin"/>
-      </w:r>
-      <w:r>
-        <w:instrText xml:space="preserve"> REF _Ref473729234 </w:instrText>
-      </w:r>
-      <w:r>
-        <w:fldChar w:fldCharType="separate"/>
-      </w:r>
-      <w:r>
-        <w:t xml:space="preserve">Table </w:t>
-      </w:r>
-      <w:r>
-        <w:rPr>
-          <w:noProof/>
-        </w:rPr>
-        <w:t>6</w:t>
-      </w:r>
-      <w:r>
-        <w:rPr>
-          <w:noProof/>
-        </w:rPr>
-        <w:fldChar w:fldCharType="end"/>
-      </w:r>
+      <w:fldSimple w:instr=" REF _Ref473729234 ">
+        <w:r>
+          <w:t xml:space="preserve">Table </w:t>
+        </w:r>
+        <w:r>
+          <w:rPr>
+            <w:noProof/>
+          </w:rPr>
+          <w:t>6</w:t>
+        </w:r>
+      </w:fldSimple>
       <w:r>
         <w:t xml:space="preserve">) includes the elements that are used only for observatories that are not at a fixed position on the surface </w:t>
       </w:r>
       <w:r>
-        <w:t xml:space="preserve">of the Earth, or do not have a specific </w:t>
+        <w:t xml:space="preserve">of the Earth, or do not </w:t>
+      </w:r>
+      <w:r>
+        <w:lastRenderedPageBreak/>
+        <w:t xml:space="preserve">have a specific </w:t>
       </w:r>
       <w:r>
         <w:t>MPC-assigned observatory code (</w:t>
@@ -16230,11 +16083,7 @@
       </w:r>
       <w:proofErr w:type="spellEnd"/>
       <w:r>
-        <w:t>). These are primarily the so-</w:t>
-      </w:r>
-      <w:r>
-        <w:lastRenderedPageBreak/>
-        <w:t xml:space="preserve">called "roving" observers (MPC observatory code 247) and space-based observatories. The Location Group must be present for such cases, but must not be present if </w:t>
+        <w:t xml:space="preserve">). These are primarily the so-called "roving" observers (MPC observatory code 247) and space-based observatories. The Location Group must be present for such cases, but must not be present if </w:t>
       </w:r>
       <w:proofErr w:type="spellStart"/>
       <w:r>
@@ -16269,27 +16118,14 @@
       <w:r>
         <w:t xml:space="preserve">Table </w:t>
       </w:r>
-      <w:r>
-        <w:fldChar w:fldCharType="begin"/>
-      </w:r>
-      <w:r>
-        <w:instrText xml:space="preserve"> SEQ Table \* ARABIC </w:instrText>
-      </w:r>
-      <w:r>
-        <w:fldChar w:fldCharType="separate"/>
-      </w:r>
-      <w:r>
-        <w:rPr>
-          <w:noProof/>
-        </w:rPr>
-        <w:t>6</w:t>
-      </w:r>
-      <w:r>
-        <w:rPr>
-          <w:noProof/>
-        </w:rPr>
-        <w:fldChar w:fldCharType="end"/>
-      </w:r>
+      <w:fldSimple w:instr=" SEQ Table \* ARABIC ">
+        <w:r>
+          <w:rPr>
+            <w:noProof/>
+          </w:rPr>
+          <w:t>6</w:t>
+        </w:r>
+      </w:fldSimple>
       <w:bookmarkEnd w:id="18"/>
       <w:r>
         <w:t xml:space="preserve"> Location Group description. The designation "</w:t>
@@ -17382,30 +17218,17 @@
       <w:r>
         <w:t xml:space="preserve"> </w:t>
       </w:r>
-      <w:r>
-        <w:fldChar w:fldCharType="begin"/>
-      </w:r>
-      <w:r>
-        <w:instrText xml:space="preserve"> REF _Ref473799965 </w:instrText>
-      </w:r>
-      <w:r>
-        <w:fldChar w:fldCharType="separate"/>
-      </w:r>
-      <w:r>
-        <w:t xml:space="preserve">Table </w:t>
-      </w:r>
-      <w:r>
-        <w:rPr>
-          <w:noProof/>
-        </w:rPr>
-        <w:t>7</w:t>
-      </w:r>
-      <w:r>
-        <w:rPr>
-          <w:noProof/>
-        </w:rPr>
-        <w:fldChar w:fldCharType="end"/>
-      </w:r>
+      <w:fldSimple w:instr=" REF _Ref473799965 ">
+        <w:r>
+          <w:t xml:space="preserve">Table </w:t>
+        </w:r>
+        <w:r>
+          <w:rPr>
+            <w:noProof/>
+          </w:rPr>
+          <w:t>7</w:t>
+        </w:r>
+      </w:fldSimple>
       <w:r>
         <w:t xml:space="preserve">. For </w:t>
       </w:r>
@@ -17653,11 +17476,8 @@
     <w:p/>
     <w:p>
       <w:r>
-        <w:t xml:space="preserve">A broader discussion of astrometric reduction techniques is beyond the scope of this document, but it should be noted that submitted astrometry should include any </w:t>
-      </w:r>
-      <w:r>
         <w:lastRenderedPageBreak/>
-        <w:t xml:space="preserve">corrections for differential color refraction that the observer is in a position </w:t>
+        <w:t xml:space="preserve">A broader discussion of astrometric reduction techniques is beyond the scope of this document, but it should be noted that submitted astrometry should include any corrections for differential color refraction that the observer is in a position </w:t>
       </w:r>
       <w:r>
         <w:t>to compute</w:t>
@@ -17675,28 +17495,15 @@
       <w:r>
         <w:t xml:space="preserve">Table </w:t>
       </w:r>
-      <w:r>
-        <w:fldChar w:fldCharType="begin"/>
-      </w:r>
-      <w:r>
-        <w:instrText xml:space="preserve"> SEQ Table \* ARABIC </w:instrText>
-      </w:r>
-      <w:r>
-        <w:fldChar w:fldCharType="separate"/>
-      </w:r>
-      <w:r>
-        <w:rPr>
-          <w:noProof/>
-        </w:rPr>
-        <w:t>7</w:t>
-      </w:r>
-      <w:r>
-        <w:rPr>
-          <w:noProof/>
-        </w:rPr>
-        <w:fldChar w:fldCharType="end"/>
-      </w:r>
-      <w:bookmarkEnd w:id="14"/>
+      <w:fldSimple w:instr=" SEQ Table \* ARABIC ">
+        <w:r>
+          <w:rPr>
+            <w:noProof/>
+          </w:rPr>
+          <w:t>7</w:t>
+        </w:r>
+      </w:fldSimple>
+      <w:bookmarkEnd w:id="13"/>
       <w:bookmarkEnd w:id="20"/>
       <w:r>
         <w:t xml:space="preserve"> Observation Group description. The allowed elements for each observation type are tabulated in the order required. All element names that ap</w:t>
@@ -19443,30 +19250,17 @@
       <w:r>
         <w:t xml:space="preserve">Photometric observations are a part of the optional Photometry Group, as depicted in </w:t>
       </w:r>
-      <w:r>
-        <w:fldChar w:fldCharType="begin"/>
-      </w:r>
-      <w:r>
-        <w:instrText xml:space="preserve"> REF _Ref473290189 </w:instrText>
-      </w:r>
-      <w:r>
-        <w:fldChar w:fldCharType="separate"/>
-      </w:r>
-      <w:r>
-        <w:t xml:space="preserve">Table </w:t>
-      </w:r>
-      <w:r>
-        <w:rPr>
-          <w:noProof/>
-        </w:rPr>
-        <w:t>8</w:t>
-      </w:r>
-      <w:r>
-        <w:rPr>
-          <w:noProof/>
-        </w:rPr>
-        <w:fldChar w:fldCharType="end"/>
-      </w:r>
+      <w:fldSimple w:instr=" REF _Ref473290189 ">
+        <w:r>
+          <w:t xml:space="preserve">Table </w:t>
+        </w:r>
+        <w:r>
+          <w:rPr>
+            <w:noProof/>
+          </w:rPr>
+          <w:t>8</w:t>
+        </w:r>
+      </w:fldSimple>
       <w:r>
         <w:t>. While the entire group is optional, if photometry is to be included with an observation then the required elements in the group must be present.</w:t>
       </w:r>
@@ -19495,27 +19289,14 @@
       <w:r>
         <w:t xml:space="preserve">Table </w:t>
       </w:r>
-      <w:r>
-        <w:fldChar w:fldCharType="begin"/>
-      </w:r>
-      <w:r>
-        <w:instrText xml:space="preserve"> SEQ Table \* ARABIC </w:instrText>
-      </w:r>
-      <w:r>
-        <w:fldChar w:fldCharType="separate"/>
-      </w:r>
-      <w:r>
-        <w:rPr>
-          <w:noProof/>
-        </w:rPr>
-        <w:t>8</w:t>
-      </w:r>
-      <w:r>
-        <w:rPr>
-          <w:noProof/>
-        </w:rPr>
-        <w:fldChar w:fldCharType="end"/>
-      </w:r>
+      <w:fldSimple w:instr=" SEQ Table \* ARABIC ">
+        <w:r>
+          <w:rPr>
+            <w:noProof/>
+          </w:rPr>
+          <w:t>8</w:t>
+        </w:r>
+      </w:fldSimple>
       <w:bookmarkEnd w:id="22"/>
       <w:r>
         <w:t xml:space="preserve"> Photometry Group description. The designation "</w:t>
@@ -20030,6 +19811,7 @@
                 <w:sz w:val="22"/>
                 <w:szCs w:val="22"/>
               </w:rPr>
+              <w:lastRenderedPageBreak/>
               <w:t>photAp</w:t>
             </w:r>
             <w:proofErr w:type="spellEnd"/>
@@ -20141,7 +19923,6 @@
       </w:pPr>
       <w:bookmarkStart w:id="23" w:name="_Toc161139889"/>
       <w:r>
-        <w:lastRenderedPageBreak/>
         <w:t>Precision Group</w:t>
       </w:r>
       <w:bookmarkEnd w:id="23"/>
@@ -20257,27 +20038,14 @@
       <w:r>
         <w:t xml:space="preserve">Table </w:t>
       </w:r>
-      <w:r>
-        <w:fldChar w:fldCharType="begin"/>
-      </w:r>
-      <w:r>
-        <w:instrText xml:space="preserve"> SEQ Table \* ARABIC </w:instrText>
-      </w:r>
-      <w:r>
-        <w:fldChar w:fldCharType="separate"/>
-      </w:r>
-      <w:r>
-        <w:rPr>
-          <w:noProof/>
-        </w:rPr>
-        <w:t>9</w:t>
-      </w:r>
-      <w:r>
-        <w:rPr>
-          <w:noProof/>
-        </w:rPr>
-        <w:fldChar w:fldCharType="end"/>
-      </w:r>
+      <w:fldSimple w:instr=" SEQ Table \* ARABIC ">
+        <w:r>
+          <w:rPr>
+            <w:noProof/>
+          </w:rPr>
+          <w:t>9</w:t>
+        </w:r>
+      </w:fldSimple>
       <w:bookmarkEnd w:id="24"/>
       <w:r>
         <w:t xml:space="preserve"> Precision Group description. The designation "</w:t>
@@ -20628,30 +20396,17 @@
     </w:p>
     <w:p/>
     <w:p>
-      <w:r>
-        <w:fldChar w:fldCharType="begin"/>
-      </w:r>
-      <w:r>
-        <w:instrText xml:space="preserve"> REF _Ref473215016 </w:instrText>
-      </w:r>
-      <w:r>
-        <w:fldChar w:fldCharType="separate"/>
-      </w:r>
-      <w:r>
-        <w:t xml:space="preserve">Table </w:t>
-      </w:r>
-      <w:r>
-        <w:rPr>
-          <w:noProof/>
-        </w:rPr>
-        <w:t>3</w:t>
-      </w:r>
-      <w:r>
-        <w:rPr>
-          <w:noProof/>
-        </w:rPr>
-        <w:fldChar w:fldCharType="end"/>
-      </w:r>
+      <w:fldSimple w:instr=" REF _Ref473215016 ">
+        <w:r>
+          <w:t xml:space="preserve">Table </w:t>
+        </w:r>
+        <w:r>
+          <w:rPr>
+            <w:noProof/>
+          </w:rPr>
+          <w:t>3</w:t>
+        </w:r>
+      </w:fldSimple>
       <w:r>
         <w:t xml:space="preserve"> indicates that there are two groups related to the exchange of observational residuals, the </w:t>
       </w:r>
@@ -20667,30 +20422,17 @@
       <w:r>
         <w:t>(</w:t>
       </w:r>
-      <w:r>
-        <w:fldChar w:fldCharType="begin"/>
-      </w:r>
-      <w:r>
-        <w:instrText xml:space="preserve"> REF _Ref473023800 </w:instrText>
-      </w:r>
-      <w:r>
-        <w:fldChar w:fldCharType="separate"/>
-      </w:r>
-      <w:r>
-        <w:t xml:space="preserve">Table </w:t>
-      </w:r>
-      <w:r>
-        <w:rPr>
-          <w:noProof/>
-        </w:rPr>
-        <w:t>10</w:t>
-      </w:r>
-      <w:r>
-        <w:rPr>
-          <w:noProof/>
-        </w:rPr>
-        <w:fldChar w:fldCharType="end"/>
-      </w:r>
+      <w:fldSimple w:instr=" REF _Ref473023800 ">
+        <w:r>
+          <w:t xml:space="preserve">Table </w:t>
+        </w:r>
+        <w:r>
+          <w:rPr>
+            <w:noProof/>
+          </w:rPr>
+          <w:t>10</w:t>
+        </w:r>
+      </w:fldSimple>
       <w:r>
         <w:t xml:space="preserve">) </w:t>
       </w:r>
@@ -20706,30 +20448,17 @@
       <w:r>
         <w:t xml:space="preserve"> (</w:t>
       </w:r>
-      <w:r>
-        <w:fldChar w:fldCharType="begin"/>
-      </w:r>
-      <w:r>
-        <w:instrText xml:space="preserve"> REF _Ref473023649 </w:instrText>
-      </w:r>
-      <w:r>
-        <w:fldChar w:fldCharType="separate"/>
-      </w:r>
-      <w:r>
-        <w:t xml:space="preserve">Table </w:t>
-      </w:r>
-      <w:r>
-        <w:rPr>
-          <w:noProof/>
-        </w:rPr>
-        <w:t>11</w:t>
-      </w:r>
-      <w:r>
-        <w:rPr>
-          <w:noProof/>
-        </w:rPr>
-        <w:fldChar w:fldCharType="end"/>
-      </w:r>
+      <w:fldSimple w:instr=" REF _Ref473023649 ">
+        <w:r>
+          <w:t xml:space="preserve">Table </w:t>
+        </w:r>
+        <w:r>
+          <w:rPr>
+            <w:noProof/>
+          </w:rPr>
+          <w:t>11</w:t>
+        </w:r>
+      </w:fldSimple>
       <w:r>
         <w:t>)</w:t>
       </w:r>
@@ -21034,27 +20763,14 @@
         <w:lastRenderedPageBreak/>
         <w:t xml:space="preserve">Table </w:t>
       </w:r>
-      <w:r>
-        <w:fldChar w:fldCharType="begin"/>
-      </w:r>
-      <w:r>
-        <w:instrText xml:space="preserve"> SEQ Table \* ARABIC </w:instrText>
-      </w:r>
-      <w:r>
-        <w:fldChar w:fldCharType="separate"/>
-      </w:r>
-      <w:r>
-        <w:rPr>
-          <w:noProof/>
-        </w:rPr>
-        <w:t>10</w:t>
-      </w:r>
-      <w:r>
-        <w:rPr>
-          <w:noProof/>
-        </w:rPr>
-        <w:fldChar w:fldCharType="end"/>
-      </w:r>
+      <w:fldSimple w:instr=" SEQ Table \* ARABIC ">
+        <w:r>
+          <w:rPr>
+            <w:noProof/>
+          </w:rPr>
+          <w:t>10</w:t>
+        </w:r>
+      </w:fldSimple>
       <w:bookmarkEnd w:id="27"/>
       <w:r>
         <w:t xml:space="preserve"> Optical Residuals Group description. The designation "</w:t>
@@ -22858,27 +22574,14 @@
       <w:r>
         <w:t xml:space="preserve">Table </w:t>
       </w:r>
-      <w:r>
-        <w:fldChar w:fldCharType="begin"/>
-      </w:r>
-      <w:r>
-        <w:instrText xml:space="preserve"> SEQ Table \* ARABIC </w:instrText>
-      </w:r>
-      <w:r>
-        <w:fldChar w:fldCharType="separate"/>
-      </w:r>
-      <w:r>
-        <w:rPr>
-          <w:noProof/>
-        </w:rPr>
-        <w:t>11</w:t>
-      </w:r>
-      <w:r>
-        <w:rPr>
-          <w:noProof/>
-        </w:rPr>
-        <w:fldChar w:fldCharType="end"/>
-      </w:r>
+      <w:fldSimple w:instr=" SEQ Table \* ARABIC ">
+        <w:r>
+          <w:rPr>
+            <w:noProof/>
+          </w:rPr>
+          <w:t>11</w:t>
+        </w:r>
+      </w:fldSimple>
       <w:bookmarkEnd w:id="28"/>
       <w:r>
         <w:t xml:space="preserve"> Radar Residuals Group description. The designation "</w:t>
@@ -23585,30 +23288,17 @@
       <w:r>
         <w:t xml:space="preserve">. As shown in </w:t>
       </w:r>
-      <w:r>
-        <w:fldChar w:fldCharType="begin"/>
-      </w:r>
-      <w:r>
-        <w:instrText xml:space="preserve"> REF _Ref473018694 </w:instrText>
-      </w:r>
-      <w:r>
-        <w:fldChar w:fldCharType="separate"/>
-      </w:r>
-      <w:r>
-        <w:t xml:space="preserve">Table </w:t>
-      </w:r>
-      <w:r>
-        <w:rPr>
-          <w:noProof/>
-        </w:rPr>
-        <w:t>12</w:t>
-      </w:r>
-      <w:r>
-        <w:rPr>
-          <w:noProof/>
-        </w:rPr>
-        <w:fldChar w:fldCharType="end"/>
-      </w:r>
+      <w:fldSimple w:instr=" REF _Ref473018694 ">
+        <w:r>
+          <w:t xml:space="preserve">Table </w:t>
+        </w:r>
+        <w:r>
+          <w:rPr>
+            <w:noProof/>
+          </w:rPr>
+          <w:t>12</w:t>
+        </w:r>
+      </w:fldSimple>
       <w:r>
         <w:t xml:space="preserve">, most of the components of </w:t>
       </w:r>
@@ -23651,30 +23341,17 @@
       <w:r>
         <w:t xml:space="preserve">In several cases, as marked with an asterisk in </w:t>
       </w:r>
-      <w:r>
-        <w:fldChar w:fldCharType="begin"/>
-      </w:r>
-      <w:r>
-        <w:instrText xml:space="preserve"> REF _Ref473018694 </w:instrText>
-      </w:r>
-      <w:r>
-        <w:fldChar w:fldCharType="separate"/>
-      </w:r>
-      <w:r>
-        <w:t xml:space="preserve">Table </w:t>
-      </w:r>
-      <w:r>
-        <w:rPr>
-          <w:noProof/>
-        </w:rPr>
-        <w:t>12</w:t>
-      </w:r>
-      <w:r>
-        <w:rPr>
-          <w:noProof/>
-        </w:rPr>
-        <w:fldChar w:fldCharType="end"/>
-      </w:r>
+      <w:fldSimple w:instr=" REF _Ref473018694 ">
+        <w:r>
+          <w:t xml:space="preserve">Table </w:t>
+        </w:r>
+        <w:r>
+          <w:rPr>
+            <w:noProof/>
+          </w:rPr>
+          <w:t>12</w:t>
+        </w:r>
+      </w:fldSimple>
       <w:r>
         <w:t xml:space="preserve">, the </w:t>
       </w:r>
@@ -23727,21 +23404,11 @@
       <w:r>
         <w:t xml:space="preserve"> element is presented in Sec. </w:t>
       </w:r>
-      <w:r>
-        <w:fldChar w:fldCharType="begin"/>
-      </w:r>
-      <w:r>
-        <w:instrText xml:space="preserve"> REF _Ref473751934 \r </w:instrText>
-      </w:r>
-      <w:r>
-        <w:fldChar w:fldCharType="separate"/>
-      </w:r>
-      <w:r>
-        <w:t>4.6</w:t>
-      </w:r>
-      <w:r>
-        <w:fldChar w:fldCharType="end"/>
-      </w:r>
+      <w:fldSimple w:instr=" REF _Ref473751934 \r ">
+        <w:r>
+          <w:t>4.6</w:t>
+        </w:r>
+      </w:fldSimple>
       <w:r>
         <w:t>.</w:t>
       </w:r>
@@ -23755,27 +23422,14 @@
       <w:r>
         <w:t xml:space="preserve">Table </w:t>
       </w:r>
-      <w:r>
-        <w:fldChar w:fldCharType="begin"/>
-      </w:r>
-      <w:r>
-        <w:instrText xml:space="preserve"> SEQ Table \* ARABIC </w:instrText>
-      </w:r>
-      <w:r>
-        <w:fldChar w:fldCharType="separate"/>
-      </w:r>
-      <w:r>
-        <w:rPr>
-          <w:noProof/>
-        </w:rPr>
-        <w:t>12</w:t>
-      </w:r>
-      <w:r>
-        <w:rPr>
-          <w:noProof/>
-        </w:rPr>
-        <w:fldChar w:fldCharType="end"/>
-      </w:r>
+      <w:fldSimple w:instr=" SEQ Table \* ARABIC ">
+        <w:r>
+          <w:rPr>
+            <w:noProof/>
+          </w:rPr>
+          <w:t>12</w:t>
+        </w:r>
+      </w:fldSimple>
       <w:bookmarkEnd w:id="31"/>
       <w:r>
         <w:t xml:space="preserve">. Elements of </w:t>
@@ -27515,30 +27169,17 @@
       <w:r>
         <w:t xml:space="preserve"> (</w:t>
       </w:r>
-      <w:r>
-        <w:fldChar w:fldCharType="begin"/>
-      </w:r>
-      <w:r>
-        <w:instrText xml:space="preserve"> REF _Ref474407666 </w:instrText>
-      </w:r>
-      <w:r>
-        <w:fldChar w:fldCharType="separate"/>
-      </w:r>
-      <w:r>
-        <w:t xml:space="preserve">Table </w:t>
-      </w:r>
-      <w:r>
-        <w:rPr>
-          <w:noProof/>
-        </w:rPr>
-        <w:t>13</w:t>
-      </w:r>
-      <w:r>
-        <w:rPr>
-          <w:noProof/>
-        </w:rPr>
-        <w:fldChar w:fldCharType="end"/>
-      </w:r>
+      <w:fldSimple w:instr=" REF _Ref474407666 ">
+        <w:r>
+          <w:t xml:space="preserve">Table </w:t>
+        </w:r>
+        <w:r>
+          <w:rPr>
+            <w:noProof/>
+          </w:rPr>
+          <w:t>13</w:t>
+        </w:r>
+      </w:fldSimple>
       <w:r>
         <w:t xml:space="preserve">) and </w:t>
       </w:r>
@@ -27553,30 +27194,17 @@
       <w:r>
         <w:t xml:space="preserve"> (</w:t>
       </w:r>
-      <w:r>
-        <w:fldChar w:fldCharType="begin"/>
-      </w:r>
-      <w:r>
-        <w:instrText xml:space="preserve"> REF _Ref474407674 </w:instrText>
-      </w:r>
-      <w:r>
-        <w:fldChar w:fldCharType="separate"/>
-      </w:r>
-      <w:r>
-        <w:t xml:space="preserve">Table </w:t>
-      </w:r>
-      <w:r>
-        <w:rPr>
-          <w:noProof/>
-        </w:rPr>
-        <w:t>14</w:t>
-      </w:r>
-      <w:r>
-        <w:rPr>
-          <w:noProof/>
-        </w:rPr>
-        <w:fldChar w:fldCharType="end"/>
-      </w:r>
+      <w:fldSimple w:instr=" REF _Ref474407674 ">
+        <w:r>
+          <w:t xml:space="preserve">Table </w:t>
+        </w:r>
+        <w:r>
+          <w:rPr>
+            <w:noProof/>
+          </w:rPr>
+          <w:t>14</w:t>
+        </w:r>
+      </w:fldSimple>
       <w:r>
         <w:t xml:space="preserve">) elements, which allow exchange of residual information without including the associated observational information. As described above, residuals may be included within an observation as detailed in the discussion of the </w:t>
       </w:r>
@@ -27589,21 +27217,11 @@
       <w:r>
         <w:t xml:space="preserve"> in Sec. </w:t>
       </w:r>
-      <w:r>
-        <w:fldChar w:fldCharType="begin"/>
-      </w:r>
-      <w:r>
-        <w:instrText xml:space="preserve"> REF _Ref474247736 \r </w:instrText>
-      </w:r>
-      <w:r>
-        <w:fldChar w:fldCharType="separate"/>
-      </w:r>
-      <w:r>
-        <w:t>4.2.6</w:t>
-      </w:r>
-      <w:r>
-        <w:fldChar w:fldCharType="end"/>
-      </w:r>
+      <w:fldSimple w:instr=" REF _Ref474247736 \r ">
+        <w:r>
+          <w:t>4.2.6</w:t>
+        </w:r>
+      </w:fldSimple>
       <w:r>
         <w:t xml:space="preserve">. However, residuals information can also appear as an immediate child of an </w:t>
       </w:r>
@@ -27661,21 +27279,11 @@
       <w:r>
         <w:t xml:space="preserve"> (Sec. </w:t>
       </w:r>
-      <w:r>
-        <w:fldChar w:fldCharType="begin"/>
-      </w:r>
-      <w:r>
-        <w:instrText xml:space="preserve"> REF _Ref474247915 \r </w:instrText>
-      </w:r>
-      <w:r>
-        <w:fldChar w:fldCharType="separate"/>
-      </w:r>
-      <w:r>
-        <w:t>4.2.1</w:t>
-      </w:r>
-      <w:r>
-        <w:fldChar w:fldCharType="end"/>
-      </w:r>
+      <w:fldSimple w:instr=" REF _Ref474247915 \r ">
+        <w:r>
+          <w:t>4.2.1</w:t>
+        </w:r>
+      </w:fldSimple>
       <w:r>
         <w:t xml:space="preserve">) as well as the </w:t>
       </w:r>
@@ -27736,30 +27344,17 @@
       <w:r>
         <w:t>(</w:t>
       </w:r>
-      <w:r>
-        <w:fldChar w:fldCharType="begin"/>
-      </w:r>
-      <w:r>
-        <w:instrText xml:space="preserve"> REF _Ref473023800 </w:instrText>
-      </w:r>
-      <w:r>
-        <w:fldChar w:fldCharType="separate"/>
-      </w:r>
-      <w:r>
-        <w:t xml:space="preserve">Table </w:t>
-      </w:r>
-      <w:r>
-        <w:rPr>
-          <w:noProof/>
-        </w:rPr>
-        <w:t>10</w:t>
-      </w:r>
-      <w:r>
-        <w:rPr>
-          <w:noProof/>
-        </w:rPr>
-        <w:fldChar w:fldCharType="end"/>
-      </w:r>
+      <w:fldSimple w:instr=" REF _Ref473023800 ">
+        <w:r>
+          <w:t xml:space="preserve">Table </w:t>
+        </w:r>
+        <w:r>
+          <w:rPr>
+            <w:noProof/>
+          </w:rPr>
+          <w:t>10</w:t>
+        </w:r>
+      </w:fldSimple>
       <w:r>
         <w:t xml:space="preserve">) </w:t>
       </w:r>
@@ -27781,30 +27376,17 @@
       <w:r>
         <w:t xml:space="preserve"> (</w:t>
       </w:r>
-      <w:r>
-        <w:fldChar w:fldCharType="begin"/>
-      </w:r>
-      <w:r>
-        <w:instrText xml:space="preserve"> REF _Ref473023649 </w:instrText>
-      </w:r>
-      <w:r>
-        <w:fldChar w:fldCharType="separate"/>
-      </w:r>
-      <w:r>
-        <w:t xml:space="preserve">Table </w:t>
-      </w:r>
-      <w:r>
-        <w:rPr>
-          <w:noProof/>
-        </w:rPr>
-        <w:t>11</w:t>
-      </w:r>
-      <w:r>
-        <w:rPr>
-          <w:noProof/>
-        </w:rPr>
-        <w:fldChar w:fldCharType="end"/>
-      </w:r>
+      <w:fldSimple w:instr=" REF _Ref473023649 ">
+        <w:r>
+          <w:t xml:space="preserve">Table </w:t>
+        </w:r>
+        <w:r>
+          <w:rPr>
+            <w:noProof/>
+          </w:rPr>
+          <w:t>11</w:t>
+        </w:r>
+      </w:fldSimple>
       <w:r>
         <w:t xml:space="preserve">) </w:t>
       </w:r>
@@ -27832,27 +27414,14 @@
       <w:r>
         <w:t xml:space="preserve">Table </w:t>
       </w:r>
-      <w:r>
-        <w:fldChar w:fldCharType="begin"/>
-      </w:r>
-      <w:r>
-        <w:instrText xml:space="preserve"> SEQ Table \* ARABIC </w:instrText>
-      </w:r>
-      <w:r>
-        <w:fldChar w:fldCharType="separate"/>
-      </w:r>
-      <w:r>
-        <w:rPr>
-          <w:noProof/>
-        </w:rPr>
-        <w:t>13</w:t>
-      </w:r>
-      <w:r>
-        <w:rPr>
-          <w:noProof/>
-        </w:rPr>
-        <w:fldChar w:fldCharType="end"/>
-      </w:r>
+      <w:fldSimple w:instr=" SEQ Table \* ARABIC ">
+        <w:r>
+          <w:rPr>
+            <w:noProof/>
+          </w:rPr>
+          <w:t>13</w:t>
+        </w:r>
+      </w:fldSimple>
       <w:bookmarkEnd w:id="35"/>
       <w:r>
         <w:t xml:space="preserve">. The </w:t>
@@ -28524,27 +28093,14 @@
       <w:r>
         <w:t xml:space="preserve">Table </w:t>
       </w:r>
-      <w:r>
-        <w:fldChar w:fldCharType="begin"/>
-      </w:r>
-      <w:r>
-        <w:instrText xml:space="preserve"> SEQ Table \* ARABIC </w:instrText>
-      </w:r>
-      <w:r>
-        <w:fldChar w:fldCharType="separate"/>
-      </w:r>
-      <w:r>
-        <w:rPr>
-          <w:noProof/>
-        </w:rPr>
-        <w:t>14</w:t>
-      </w:r>
-      <w:r>
-        <w:rPr>
-          <w:noProof/>
-        </w:rPr>
-        <w:fldChar w:fldCharType="end"/>
-      </w:r>
+      <w:fldSimple w:instr=" SEQ Table \* ARABIC ">
+        <w:r>
+          <w:rPr>
+            <w:noProof/>
+          </w:rPr>
+          <w:t>14</w:t>
+        </w:r>
+      </w:fldSimple>
       <w:bookmarkEnd w:id="36"/>
       <w:r>
         <w:t xml:space="preserve">. The </w:t>
@@ -29204,30 +28760,17 @@
       <w:r>
         <w:t xml:space="preserve"> (</w:t>
       </w:r>
-      <w:r>
-        <w:fldChar w:fldCharType="begin"/>
-      </w:r>
-      <w:r>
-        <w:instrText xml:space="preserve"> REF _Ref473059785 </w:instrText>
-      </w:r>
-      <w:r>
-        <w:fldChar w:fldCharType="separate"/>
-      </w:r>
-      <w:r>
-        <w:t xml:space="preserve">Table </w:t>
-      </w:r>
-      <w:r>
-        <w:rPr>
-          <w:noProof/>
-        </w:rPr>
-        <w:t>16</w:t>
-      </w:r>
-      <w:r>
-        <w:rPr>
-          <w:noProof/>
-        </w:rPr>
-        <w:fldChar w:fldCharType="end"/>
-      </w:r>
+      <w:fldSimple w:instr=" REF _Ref473059785 ">
+        <w:r>
+          <w:t xml:space="preserve">Table </w:t>
+        </w:r>
+        <w:r>
+          <w:rPr>
+            <w:noProof/>
+          </w:rPr>
+          <w:t>16</w:t>
+        </w:r>
+      </w:fldSimple>
       <w:r>
         <w:t>)</w:t>
       </w:r>
@@ -29286,30 +28829,17 @@
       <w:r>
         <w:t xml:space="preserve"> observation context (</w:t>
       </w:r>
-      <w:r>
-        <w:fldChar w:fldCharType="begin"/>
-      </w:r>
-      <w:r>
-        <w:instrText xml:space="preserve"> REF _Ref473211605 </w:instrText>
-      </w:r>
-      <w:r>
-        <w:fldChar w:fldCharType="separate"/>
-      </w:r>
-      <w:r>
-        <w:t xml:space="preserve">Table </w:t>
-      </w:r>
-      <w:r>
-        <w:rPr>
-          <w:noProof/>
-        </w:rPr>
-        <w:t>18</w:t>
-      </w:r>
-      <w:r>
-        <w:rPr>
-          <w:noProof/>
-        </w:rPr>
-        <w:fldChar w:fldCharType="end"/>
-      </w:r>
+      <w:fldSimple w:instr=" REF _Ref473211605 ">
+        <w:r>
+          <w:t xml:space="preserve">Table </w:t>
+        </w:r>
+        <w:r>
+          <w:rPr>
+            <w:noProof/>
+          </w:rPr>
+          <w:t>18</w:t>
+        </w:r>
+      </w:fldSimple>
       <w:r>
         <w:t>)</w:t>
       </w:r>
@@ -29451,30 +28981,17 @@
       <w:r>
         <w:t xml:space="preserve">Similarly, photometry with magnitude uncertainties in the range 0.1-1.0 may be reasonably reported to the nearest 0.01 mag. </w:t>
       </w:r>
-      <w:r>
-        <w:fldChar w:fldCharType="begin"/>
-      </w:r>
-      <w:r>
-        <w:instrText xml:space="preserve"> REF _Ref474847522 </w:instrText>
-      </w:r>
-      <w:r>
-        <w:fldChar w:fldCharType="separate"/>
-      </w:r>
-      <w:r>
-        <w:t xml:space="preserve">Figure </w:t>
-      </w:r>
-      <w:r>
-        <w:rPr>
-          <w:noProof/>
-        </w:rPr>
-        <w:t>1</w:t>
-      </w:r>
-      <w:r>
-        <w:rPr>
-          <w:noProof/>
-        </w:rPr>
-        <w:fldChar w:fldCharType="end"/>
-      </w:r>
+      <w:fldSimple w:instr=" REF _Ref474847522 ">
+        <w:r>
+          <w:t xml:space="preserve">Figure </w:t>
+        </w:r>
+        <w:r>
+          <w:rPr>
+            <w:noProof/>
+          </w:rPr>
+          <w:t>1</w:t>
+        </w:r>
+      </w:fldSimple>
       <w:r>
         <w:t xml:space="preserve"> provides guidance on how many digits should be reported after the decimal point for </w:t>
       </w:r>
@@ -29725,27 +29242,14 @@
       <w:r>
         <w:t xml:space="preserve">Figure </w:t>
       </w:r>
-      <w:r>
-        <w:fldChar w:fldCharType="begin"/>
-      </w:r>
-      <w:r>
-        <w:instrText xml:space="preserve"> SEQ Figure \* ARABIC </w:instrText>
-      </w:r>
-      <w:r>
-        <w:fldChar w:fldCharType="separate"/>
-      </w:r>
-      <w:r>
-        <w:rPr>
-          <w:noProof/>
-        </w:rPr>
-        <w:t>1</w:t>
-      </w:r>
-      <w:r>
-        <w:rPr>
-          <w:noProof/>
-        </w:rPr>
-        <w:fldChar w:fldCharType="end"/>
-      </w:r>
+      <w:fldSimple w:instr=" SEQ Figure \* ARABIC ">
+        <w:r>
+          <w:rPr>
+            <w:noProof/>
+          </w:rPr>
+          <w:t>1</w:t>
+        </w:r>
+      </w:fldSimple>
       <w:bookmarkEnd w:id="39"/>
       <w:r>
         <w:t>. Suggested numerical precision in ADES observations for RA-DEC astrometry (left) and photometry (right) as a function of the measurement uncertainty.</w:t>
@@ -29761,27 +29265,14 @@
       <w:r>
         <w:t xml:space="preserve">Table </w:t>
       </w:r>
-      <w:r>
-        <w:fldChar w:fldCharType="begin"/>
-      </w:r>
-      <w:r>
-        <w:instrText xml:space="preserve"> SEQ Table \* ARABIC </w:instrText>
-      </w:r>
-      <w:r>
-        <w:fldChar w:fldCharType="separate"/>
-      </w:r>
-      <w:r>
-        <w:rPr>
-          <w:noProof/>
-        </w:rPr>
-        <w:t>15</w:t>
-      </w:r>
-      <w:r>
-        <w:rPr>
-          <w:noProof/>
-        </w:rPr>
-        <w:fldChar w:fldCharType="end"/>
-      </w:r>
+      <w:fldSimple w:instr=" SEQ Table \* ARABIC ">
+        <w:r>
+          <w:rPr>
+            <w:noProof/>
+          </w:rPr>
+          <w:t>15</w:t>
+        </w:r>
+      </w:fldSimple>
       <w:bookmarkEnd w:id="40"/>
       <w:r>
         <w:t xml:space="preserve">. </w:t>
@@ -30512,27 +30003,14 @@
         <w:lastRenderedPageBreak/>
         <w:t xml:space="preserve">Table </w:t>
       </w:r>
-      <w:r>
-        <w:fldChar w:fldCharType="begin"/>
-      </w:r>
-      <w:r>
-        <w:instrText xml:space="preserve"> SEQ Table \* ARABIC </w:instrText>
-      </w:r>
-      <w:r>
-        <w:fldChar w:fldCharType="separate"/>
-      </w:r>
-      <w:r>
-        <w:rPr>
-          <w:noProof/>
-        </w:rPr>
-        <w:t>16</w:t>
-      </w:r>
-      <w:r>
-        <w:rPr>
-          <w:noProof/>
-        </w:rPr>
-        <w:fldChar w:fldCharType="end"/>
-      </w:r>
+      <w:fldSimple w:instr=" SEQ Table \* ARABIC ">
+        <w:r>
+          <w:rPr>
+            <w:noProof/>
+          </w:rPr>
+          <w:t>16</w:t>
+        </w:r>
+      </w:fldSimple>
       <w:bookmarkEnd w:id="41"/>
       <w:r>
         <w:t xml:space="preserve">. Observation </w:t>
@@ -30543,48 +30021,25 @@
       <w:r>
         <w:t xml:space="preserve">Elements associated with a grouping as discussed in Sec. </w:t>
       </w:r>
-      <w:r>
-        <w:fldChar w:fldCharType="begin"/>
-      </w:r>
-      <w:r>
-        <w:instrText xml:space="preserve"> REF _Ref473301578 \r </w:instrText>
-      </w:r>
-      <w:r>
-        <w:fldChar w:fldCharType="separate"/>
-      </w:r>
-      <w:r>
-        <w:t>4.2</w:t>
-      </w:r>
-      <w:r>
-        <w:fldChar w:fldCharType="end"/>
-      </w:r>
+      <w:fldSimple w:instr=" REF _Ref473301578 \r ">
+        <w:r>
+          <w:t>4.2</w:t>
+        </w:r>
+      </w:fldSimple>
       <w:r>
         <w:t xml:space="preserve">  and </w:t>
       </w:r>
-      <w:r>
-        <w:fldChar w:fldCharType="begin"/>
-      </w:r>
-      <w:r>
-        <w:instrText xml:space="preserve"> REF _Ref473215016 </w:instrText>
-      </w:r>
-      <w:r>
-        <w:fldChar w:fldCharType="separate"/>
-      </w:r>
-      <w:r>
-        <w:t xml:space="preserve">Table </w:t>
-      </w:r>
-      <w:r>
-        <w:rPr>
-          <w:noProof/>
-        </w:rPr>
-        <w:t>3</w:t>
-      </w:r>
-      <w:r>
-        <w:rPr>
-          <w:noProof/>
-        </w:rPr>
-        <w:fldChar w:fldCharType="end"/>
-      </w:r>
+      <w:fldSimple w:instr=" REF _Ref473215016 ">
+        <w:r>
+          <w:t xml:space="preserve">Table </w:t>
+        </w:r>
+        <w:r>
+          <w:rPr>
+            <w:noProof/>
+          </w:rPr>
+          <w:t>3</w:t>
+        </w:r>
+      </w:fldSimple>
       <w:r>
         <w:t xml:space="preserve"> are highlighted by gray shading.</w:t>
       </w:r>
@@ -42514,27 +41969,14 @@
         <w:lastRenderedPageBreak/>
         <w:t xml:space="preserve">Table </w:t>
       </w:r>
-      <w:r>
-        <w:fldChar w:fldCharType="begin"/>
-      </w:r>
-      <w:r>
-        <w:instrText xml:space="preserve"> SEQ Table \* ARABIC </w:instrText>
-      </w:r>
-      <w:r>
-        <w:fldChar w:fldCharType="separate"/>
-      </w:r>
-      <w:r>
-        <w:rPr>
-          <w:noProof/>
-        </w:rPr>
-        <w:t>17</w:t>
-      </w:r>
-      <w:r>
-        <w:rPr>
-          <w:noProof/>
-        </w:rPr>
-        <w:fldChar w:fldCharType="end"/>
-      </w:r>
+      <w:fldSimple w:instr=" SEQ Table \* ARABIC ">
+        <w:r>
+          <w:rPr>
+            <w:noProof/>
+          </w:rPr>
+          <w:t>17</w:t>
+        </w:r>
+      </w:fldSimple>
       <w:bookmarkEnd w:id="43"/>
       <w:r>
         <w:t xml:space="preserve">. Residual </w:t>
@@ -45569,27 +45011,14 @@
         <w:lastRenderedPageBreak/>
         <w:t xml:space="preserve">Table </w:t>
       </w:r>
-      <w:r>
-        <w:fldChar w:fldCharType="begin"/>
-      </w:r>
-      <w:r>
-        <w:instrText xml:space="preserve"> SEQ Table \* ARABIC </w:instrText>
-      </w:r>
-      <w:r>
-        <w:fldChar w:fldCharType="separate"/>
-      </w:r>
-      <w:r>
-        <w:rPr>
-          <w:noProof/>
-        </w:rPr>
-        <w:t>18</w:t>
-      </w:r>
-      <w:r>
-        <w:rPr>
-          <w:noProof/>
-        </w:rPr>
-        <w:fldChar w:fldCharType="end"/>
-      </w:r>
+      <w:fldSimple w:instr=" SEQ Table \* ARABIC ">
+        <w:r>
+          <w:rPr>
+            <w:noProof/>
+          </w:rPr>
+          <w:t>18</w:t>
+        </w:r>
+      </w:fldSimple>
       <w:bookmarkEnd w:id="44"/>
       <w:r>
         <w:t xml:space="preserve">. Observation context </w:t>
@@ -50630,21 +50059,11 @@
       <w:r>
         <w:t xml:space="preserve"> the PSV translation of the XML example file given in Sec. </w:t>
       </w:r>
-      <w:r>
-        <w:fldChar w:fldCharType="begin"/>
-      </w:r>
-      <w:r>
-        <w:instrText xml:space="preserve"> REF _Ref473751934 \r </w:instrText>
-      </w:r>
-      <w:r>
-        <w:fldChar w:fldCharType="separate"/>
-      </w:r>
-      <w:r>
-        <w:t>4.6</w:t>
-      </w:r>
-      <w:r>
-        <w:fldChar w:fldCharType="end"/>
-      </w:r>
+      <w:fldSimple w:instr=" REF _Ref473751934 \r ">
+        <w:r>
+          <w:t>4.6</w:t>
+        </w:r>
+      </w:fldSimple>
       <w:r>
         <w:t>, above.</w:t>
       </w:r>
@@ -51928,30 +51347,17 @@
       <w:r>
         <w:t>The Identification Group elements (</w:t>
       </w:r>
-      <w:r>
-        <w:fldChar w:fldCharType="begin"/>
-      </w:r>
-      <w:r>
-        <w:instrText xml:space="preserve"> REF _Ref473729153 </w:instrText>
-      </w:r>
-      <w:r>
-        <w:fldChar w:fldCharType="separate"/>
-      </w:r>
-      <w:r>
-        <w:t xml:space="preserve">Table </w:t>
-      </w:r>
-      <w:r>
-        <w:rPr>
-          <w:noProof/>
-        </w:rPr>
-        <w:t>4</w:t>
-      </w:r>
-      <w:r>
-        <w:rPr>
-          <w:noProof/>
-        </w:rPr>
-        <w:fldChar w:fldCharType="end"/>
-      </w:r>
+      <w:fldSimple w:instr=" REF _Ref473729153 ">
+        <w:r>
+          <w:t xml:space="preserve">Table </w:t>
+        </w:r>
+        <w:r>
+          <w:rPr>
+            <w:noProof/>
+          </w:rPr>
+          <w:t>4</w:t>
+        </w:r>
+      </w:fldSimple>
       <w:r>
         <w:t xml:space="preserve">) must be the first elements appearing on a Keyword Record. This assures that a Data Record is not mistaken as an </w:t>
       </w:r>
@@ -52227,178 +51633,126 @@
       <w:r>
         <w:t xml:space="preserve">. </w:t>
       </w:r>
-      <w:r>
-        <w:fldChar w:fldCharType="begin"/>
-      </w:r>
-      <w:r>
-        <w:instrText xml:space="preserve"> REF _Ref474910346 </w:instrText>
-      </w:r>
-      <w:r>
-        <w:fldChar w:fldCharType="separate"/>
-      </w:r>
-      <w:r>
-        <w:t xml:space="preserve">Table </w:t>
-      </w:r>
+      <w:fldSimple w:instr=" REF _Ref474910346 ">
+        <w:r>
+          <w:t xml:space="preserve">Table </w:t>
+        </w:r>
+        <w:r>
+          <w:rPr>
+            <w:noProof/>
+          </w:rPr>
+          <w:t>19</w:t>
+        </w:r>
+      </w:fldSimple>
+      <w:r>
+        <w:t xml:space="preserve"> </w:t>
+      </w:r>
+      <w:r>
+        <w:t xml:space="preserve">lists the </w:t>
+      </w:r>
+      <w:r>
+        <w:t>element</w:t>
+      </w:r>
+      <w:r>
+        <w:t xml:space="preserve"> names, their order and the field width for </w:t>
+      </w:r>
+      <w:r>
+        <w:t>the</w:t>
+      </w:r>
+      <w:r>
+        <w:t xml:space="preserve"> default </w:t>
+      </w:r>
+      <w:r>
+        <w:rPr>
+          <w:rFonts w:ascii="Courier" w:hAnsi="Courier"/>
+        </w:rPr>
+        <w:t>optical</w:t>
+      </w:r>
+      <w:r>
+        <w:t xml:space="preserve"> template</w:t>
+      </w:r>
+      <w:r>
+        <w:t xml:space="preserve">. </w:t>
+      </w:r>
+      <w:r>
+        <w:t xml:space="preserve">In some cases, e.g., </w:t>
+      </w:r>
+      <w:r>
+        <w:rPr>
+          <w:rFonts w:ascii="Courier" w:hAnsi="Courier"/>
+        </w:rPr>
+        <w:t>prog</w:t>
+      </w:r>
+      <w:r>
+        <w:t xml:space="preserve"> and </w:t>
+      </w:r>
+      <w:proofErr w:type="spellStart"/>
+      <w:r>
+        <w:rPr>
+          <w:rFonts w:ascii="Courier" w:hAnsi="Courier"/>
+        </w:rPr>
+        <w:t>rmsCorr</w:t>
+      </w:r>
+      <w:proofErr w:type="spellEnd"/>
+      <w:r>
+        <w:t xml:space="preserve">, the field widths in </w:t>
+      </w:r>
+      <w:fldSimple w:instr=" REF _Ref474910346 ">
+        <w:r>
+          <w:t xml:space="preserve">Table </w:t>
+        </w:r>
+        <w:r>
+          <w:rPr>
+            <w:noProof/>
+          </w:rPr>
+          <w:t>19</w:t>
+        </w:r>
+      </w:fldSimple>
+      <w:r>
+        <w:t xml:space="preserve"> are wider than the data in order to </w:t>
+      </w:r>
+      <w:proofErr w:type="spellStart"/>
+      <w:r>
+        <w:t>accomodate</w:t>
+      </w:r>
+      <w:proofErr w:type="spellEnd"/>
+      <w:r>
+        <w:t xml:space="preserve"> the width of the field name. </w:t>
+      </w:r>
+      <w:r>
+        <w:t xml:space="preserve">Any fields present in the record but not listed in </w:t>
+      </w:r>
+      <w:fldSimple w:instr=" REF _Ref474910346 ">
+        <w:r>
+          <w:t xml:space="preserve">Table </w:t>
+        </w:r>
+        <w:r>
+          <w:rPr>
+            <w:noProof/>
+          </w:rPr>
+          <w:t>19</w:t>
+        </w:r>
+      </w:fldSimple>
       <w:r>
         <w:rPr>
           <w:noProof/>
         </w:rPr>
-        <w:t>19</w:t>
-      </w:r>
-      <w:r>
-        <w:rPr>
-          <w:noProof/>
-        </w:rPr>
-        <w:fldChar w:fldCharType="end"/>
-      </w:r>
-      <w:r>
         <w:t xml:space="preserve"> </w:t>
       </w:r>
       <w:r>
-        <w:t xml:space="preserve">lists the </w:t>
-      </w:r>
-      <w:r>
-        <w:t>element</w:t>
-      </w:r>
-      <w:r>
-        <w:t xml:space="preserve"> names, their order and the field width for </w:t>
-      </w:r>
-      <w:r>
-        <w:t>the</w:t>
-      </w:r>
-      <w:r>
-        <w:t xml:space="preserve"> default </w:t>
-      </w:r>
-      <w:r>
-        <w:rPr>
-          <w:rFonts w:ascii="Courier" w:hAnsi="Courier"/>
-        </w:rPr>
-        <w:t>optical</w:t>
-      </w:r>
-      <w:r>
-        <w:t xml:space="preserve"> template</w:t>
-      </w:r>
-      <w:r>
-        <w:t xml:space="preserve">. </w:t>
-      </w:r>
-      <w:r>
-        <w:t xml:space="preserve">In some cases, e.g., </w:t>
-      </w:r>
-      <w:r>
-        <w:rPr>
-          <w:rFonts w:ascii="Courier" w:hAnsi="Courier"/>
-        </w:rPr>
-        <w:t>prog</w:t>
-      </w:r>
-      <w:r>
-        <w:t xml:space="preserve"> and </w:t>
-      </w:r>
-      <w:proofErr w:type="spellStart"/>
-      <w:r>
-        <w:rPr>
-          <w:rFonts w:ascii="Courier" w:hAnsi="Courier"/>
-        </w:rPr>
-        <w:t>rmsCorr</w:t>
-      </w:r>
-      <w:proofErr w:type="spellEnd"/>
-      <w:r>
-        <w:t xml:space="preserve">, the field widths in </w:t>
-      </w:r>
-      <w:r>
-        <w:fldChar w:fldCharType="begin"/>
-      </w:r>
-      <w:r>
-        <w:instrText xml:space="preserve"> REF _Ref474910346 </w:instrText>
-      </w:r>
-      <w:r>
-        <w:fldChar w:fldCharType="separate"/>
-      </w:r>
-      <w:r>
-        <w:t xml:space="preserve">Table </w:t>
-      </w:r>
-      <w:r>
-        <w:rPr>
-          <w:noProof/>
-        </w:rPr>
-        <w:t>19</w:t>
-      </w:r>
-      <w:r>
-        <w:rPr>
-          <w:noProof/>
-        </w:rPr>
-        <w:fldChar w:fldCharType="end"/>
-      </w:r>
-      <w:r>
-        <w:t xml:space="preserve"> are wider than the data in order to </w:t>
-      </w:r>
-      <w:proofErr w:type="spellStart"/>
-      <w:r>
-        <w:t>accomodate</w:t>
-      </w:r>
-      <w:proofErr w:type="spellEnd"/>
-      <w:r>
-        <w:t xml:space="preserve"> the width of the field name. </w:t>
-      </w:r>
-      <w:r>
-        <w:t xml:space="preserve">Any fields present in the record but not listed in </w:t>
-      </w:r>
-      <w:r>
-        <w:fldChar w:fldCharType="begin"/>
-      </w:r>
-      <w:r>
-        <w:instrText xml:space="preserve"> REF _Ref474910346 </w:instrText>
-      </w:r>
-      <w:r>
-        <w:fldChar w:fldCharType="separate"/>
-      </w:r>
-      <w:r>
-        <w:t xml:space="preserve">Table </w:t>
-      </w:r>
-      <w:r>
-        <w:rPr>
-          <w:noProof/>
-        </w:rPr>
-        <w:t>19</w:t>
-      </w:r>
-      <w:r>
-        <w:rPr>
-          <w:noProof/>
-        </w:rPr>
-        <w:fldChar w:fldCharType="end"/>
-      </w:r>
-      <w:r>
-        <w:rPr>
-          <w:noProof/>
-        </w:rPr>
-        <w:t xml:space="preserve"> </w:t>
-      </w:r>
-      <w:r>
         <w:t xml:space="preserve">will be placed in </w:t>
       </w:r>
-      <w:r>
-        <w:fldChar w:fldCharType="begin"/>
-      </w:r>
-      <w:r>
-        <w:instrText xml:space="preserve"> REF _Ref473059785 </w:instrText>
-      </w:r>
-      <w:r>
-        <w:fldChar w:fldCharType="separate"/>
-      </w:r>
-      <w:r>
-        <w:t xml:space="preserve">Table </w:t>
-      </w:r>
-      <w:r>
-        <w:rPr>
-          <w:noProof/>
-        </w:rPr>
-        <w:t>16</w:t>
-      </w:r>
-      <w:r>
-        <w:rPr>
-          <w:noProof/>
-        </w:rPr>
-        <w:fldChar w:fldCharType="end"/>
-      </w:r>
+      <w:fldSimple w:instr=" REF _Ref473059785 ">
+        <w:r>
+          <w:t xml:space="preserve">Table </w:t>
+        </w:r>
+        <w:r>
+          <w:rPr>
+            <w:noProof/>
+          </w:rPr>
+          <w:t>16</w:t>
+        </w:r>
+      </w:fldSimple>
       <w:r>
         <w:t xml:space="preserve"> order between the </w:t>
       </w:r>
@@ -52467,27 +51821,14 @@
       <w:r>
         <w:t xml:space="preserve">Table </w:t>
       </w:r>
-      <w:r>
-        <w:fldChar w:fldCharType="begin"/>
-      </w:r>
-      <w:r>
-        <w:instrText xml:space="preserve"> SEQ Table \* ARABIC </w:instrText>
-      </w:r>
-      <w:r>
-        <w:fldChar w:fldCharType="separate"/>
-      </w:r>
-      <w:r>
-        <w:rPr>
-          <w:noProof/>
-        </w:rPr>
-        <w:t>19</w:t>
-      </w:r>
-      <w:r>
-        <w:rPr>
-          <w:noProof/>
-        </w:rPr>
-        <w:fldChar w:fldCharType="end"/>
-      </w:r>
+      <w:fldSimple w:instr=" SEQ Table \* ARABIC ">
+        <w:r>
+          <w:rPr>
+            <w:noProof/>
+          </w:rPr>
+          <w:t>19</w:t>
+        </w:r>
+      </w:fldSimple>
       <w:bookmarkEnd w:id="52"/>
       <w:r>
         <w:t xml:space="preserve">. Field formatting for the default </w:t>
@@ -54851,30 +54192,17 @@
       <w:r>
         <w:t xml:space="preserve"> observations, the default template follows </w:t>
       </w:r>
-      <w:r>
-        <w:fldChar w:fldCharType="begin"/>
-      </w:r>
-      <w:r>
-        <w:instrText xml:space="preserve"> REF _Ref474910346 </w:instrText>
-      </w:r>
-      <w:r>
-        <w:fldChar w:fldCharType="separate"/>
-      </w:r>
-      <w:r>
-        <w:t xml:space="preserve">Table </w:t>
-      </w:r>
-      <w:r>
-        <w:rPr>
-          <w:noProof/>
-        </w:rPr>
-        <w:t>19</w:t>
-      </w:r>
-      <w:r>
-        <w:rPr>
-          <w:noProof/>
-        </w:rPr>
-        <w:fldChar w:fldCharType="end"/>
-      </w:r>
+      <w:fldSimple w:instr=" REF _Ref474910346 ">
+        <w:r>
+          <w:t xml:space="preserve">Table </w:t>
+        </w:r>
+        <w:r>
+          <w:rPr>
+            <w:noProof/>
+          </w:rPr>
+          <w:t>19</w:t>
+        </w:r>
+      </w:fldSimple>
       <w:r>
         <w:rPr>
           <w:noProof/>
@@ -54946,30 +54274,17 @@
         </w:rPr>
         <w:t xml:space="preserve">) shown in </w:t>
       </w:r>
-      <w:r>
-        <w:fldChar w:fldCharType="begin"/>
-      </w:r>
-      <w:r>
-        <w:instrText xml:space="preserve"> REF _Ref474910346 </w:instrText>
-      </w:r>
-      <w:r>
-        <w:fldChar w:fldCharType="separate"/>
-      </w:r>
-      <w:r>
-        <w:t xml:space="preserve">Table </w:t>
-      </w:r>
-      <w:r>
-        <w:rPr>
-          <w:noProof/>
-        </w:rPr>
-        <w:t>19</w:t>
-      </w:r>
-      <w:r>
-        <w:rPr>
-          <w:noProof/>
-        </w:rPr>
-        <w:fldChar w:fldCharType="end"/>
-      </w:r>
+      <w:fldSimple w:instr=" REF _Ref474910346 ">
+        <w:r>
+          <w:t xml:space="preserve">Table </w:t>
+        </w:r>
+        <w:r>
+          <w:rPr>
+            <w:noProof/>
+          </w:rPr>
+          <w:t>19</w:t>
+        </w:r>
+      </w:fldSimple>
       <w:r>
         <w:rPr>
           <w:noProof/>
@@ -55041,30 +54356,17 @@
         </w:rPr>
         <w:t xml:space="preserve"> in </w:t>
       </w:r>
-      <w:r>
-        <w:fldChar w:fldCharType="begin"/>
-      </w:r>
-      <w:r>
-        <w:instrText xml:space="preserve"> REF _Ref474910346 </w:instrText>
-      </w:r>
-      <w:r>
-        <w:fldChar w:fldCharType="separate"/>
-      </w:r>
-      <w:r>
-        <w:t xml:space="preserve">Table </w:t>
-      </w:r>
-      <w:r>
-        <w:rPr>
-          <w:noProof/>
-        </w:rPr>
-        <w:t>19</w:t>
-      </w:r>
-      <w:r>
-        <w:rPr>
-          <w:noProof/>
-        </w:rPr>
-        <w:fldChar w:fldCharType="end"/>
-      </w:r>
+      <w:fldSimple w:instr=" REF _Ref474910346 ">
+        <w:r>
+          <w:t xml:space="preserve">Table </w:t>
+        </w:r>
+        <w:r>
+          <w:rPr>
+            <w:noProof/>
+          </w:rPr>
+          <w:t>19</w:t>
+        </w:r>
+      </w:fldSimple>
       <w:r>
         <w:rPr>
           <w:noProof/>
@@ -55175,30 +54477,17 @@
         </w:rPr>
         <w:t xml:space="preserve"> elements in </w:t>
       </w:r>
-      <w:r>
-        <w:fldChar w:fldCharType="begin"/>
-      </w:r>
-      <w:r>
-        <w:instrText xml:space="preserve"> REF _Ref474910346 </w:instrText>
-      </w:r>
-      <w:r>
-        <w:fldChar w:fldCharType="separate"/>
-      </w:r>
-      <w:r>
-        <w:t xml:space="preserve">Table </w:t>
-      </w:r>
-      <w:r>
-        <w:rPr>
-          <w:noProof/>
-        </w:rPr>
-        <w:t>19</w:t>
-      </w:r>
-      <w:r>
-        <w:rPr>
-          <w:noProof/>
-        </w:rPr>
-        <w:fldChar w:fldCharType="end"/>
-      </w:r>
+      <w:fldSimple w:instr=" REF _Ref474910346 ">
+        <w:r>
+          <w:t xml:space="preserve">Table </w:t>
+        </w:r>
+        <w:r>
+          <w:rPr>
+            <w:noProof/>
+          </w:rPr>
+          <w:t>19</w:t>
+        </w:r>
+      </w:fldSimple>
       <w:r>
         <w:rPr>
           <w:noProof/>
@@ -59899,7 +59188,7 @@
 </file>
 
 <file path=customXml/itemProps1.xml><?xml version="1.0" encoding="utf-8"?>
-<ds:datastoreItem xmlns:ds="http://schemas.openxmlformats.org/officeDocument/2006/customXml" ds:itemID="{C9A62F9B-7BFC-CE46-9BD4-F433CC493A18}">
+<ds:datastoreItem xmlns:ds="http://schemas.openxmlformats.org/officeDocument/2006/customXml" ds:itemID="{43323534-9E77-5B41-9410-F59E6BB02A37}">
   <ds:schemaRefs>
     <ds:schemaRef ds:uri="http://schemas.openxmlformats.org/officeDocument/2006/bibliography"/>
   </ds:schemaRefs>

</xml_diff>